<commit_message>
Update Week 5 lecture notes with additional explanations
</commit_message>
<xml_diff>
--- a/Week-5-useEffect-and-Data-Fetching-Complete-Lecture-Notes.docx
+++ b/Week-5-useEffect-and-Data-Fetching-Complete-Lecture-Notes.docx
@@ -885,21 +885,6 @@
       <w:pPr>
         <w:spacing w:before="0" w:after="200" w:line="276"/>
         <w:ind w:right="0" w:left="0" w:firstLine="0"/>
-        <w:jc w:val="left"/>
-        <w:rPr>
-          <w:rFonts w:ascii="Cambria" w:hAnsi="Cambria" w:cs="Cambria" w:eastAsia="Cambria"/>
-          <w:color w:val="auto"/>
-          <w:spacing w:val="0"/>
-          <w:position w:val="0"/>
-          <w:sz w:val="22"/>
-          <w:shd w:fill="auto" w:val="clear"/>
-        </w:rPr>
-      </w:pPr>
-    </w:p>
-    <w:p>
-      <w:pPr>
-        <w:spacing w:before="0" w:after="200" w:line="276"/>
-        <w:ind w:right="0" w:left="0" w:firstLine="0"/>
         <w:jc w:val="center"/>
         <w:rPr>
           <w:rFonts w:ascii="Cambria" w:hAnsi="Cambria" w:cs="Cambria" w:eastAsia="Cambria"/>
@@ -922,18 +907,91 @@
           <w:shd w:fill="auto" w:val="clear"/>
         </w:rPr>
         <w:t xml:space="preserve">THE END </w:t>
-      </w:r>
-      <w:r>
-        <w:rPr>
-          <w:rFonts w:ascii="Cambria" w:hAnsi="Cambria" w:cs="Cambria" w:eastAsia="Cambria"/>
-          <w:color w:val="auto"/>
-          <w:spacing w:val="0"/>
-          <w:position w:val="0"/>
-          <w:sz w:val="22"/>
-          <w:shd w:fill="auto" w:val="clear"/>
-        </w:rPr>
-        <w:br/>
-      </w:r>
+        <w:br/>
+      </w:r>
+    </w:p>
+    <w:p>
+      <w:pPr>
+        <w:spacing w:before="0" w:after="200" w:line="276"/>
+        <w:ind w:right="0" w:left="0" w:firstLine="0"/>
+        <w:jc w:val="left"/>
+        <w:rPr>
+          <w:rFonts w:ascii="Cambria" w:hAnsi="Cambria" w:cs="Cambria" w:eastAsia="Cambria"/>
+          <w:color w:val="auto"/>
+          <w:spacing w:val="0"/>
+          <w:position w:val="0"/>
+          <w:sz w:val="22"/>
+          <w:shd w:fill="auto" w:val="clear"/>
+        </w:rPr>
+      </w:pPr>
+      <w:r>
+        <w:rPr>
+          <w:rFonts w:ascii="Cambria" w:hAnsi="Cambria" w:cs="Cambria" w:eastAsia="Cambria"/>
+          <w:color w:val="auto"/>
+          <w:spacing w:val="0"/>
+          <w:position w:val="0"/>
+          <w:sz w:val="22"/>
+          <w:shd w:fill="auto" w:val="clear"/>
+        </w:rPr>
+        <w:t xml:space="preserve">Free api key here</w:t>
+        <w:br/>
+        <w:t xml:space="preserve">Step 1: Get Free API Key</w:t>
+      </w:r>
+    </w:p>
+    <w:p>
+      <w:pPr>
+        <w:spacing w:before="0" w:after="200" w:line="276"/>
+        <w:ind w:right="0" w:left="0" w:firstLine="0"/>
+        <w:jc w:val="left"/>
+        <w:rPr>
+          <w:rFonts w:ascii="Cambria" w:hAnsi="Cambria" w:cs="Cambria" w:eastAsia="Cambria"/>
+          <w:color w:val="auto"/>
+          <w:spacing w:val="0"/>
+          <w:position w:val="0"/>
+          <w:sz w:val="22"/>
+          <w:shd w:fill="auto" w:val="clear"/>
+        </w:rPr>
+      </w:pPr>
+      <w:r>
+        <w:rPr>
+          <w:rFonts w:ascii="Cambria" w:hAnsi="Cambria" w:cs="Cambria" w:eastAsia="Cambria"/>
+          <w:color w:val="auto"/>
+          <w:spacing w:val="0"/>
+          <w:position w:val="0"/>
+          <w:sz w:val="22"/>
+          <w:shd w:fill="auto" w:val="clear"/>
+        </w:rPr>
+        <w:t xml:space="preserve">Go to:</w:t>
+      </w:r>
+    </w:p>
+    <w:p>
+      <w:pPr>
+        <w:spacing w:before="0" w:after="200" w:line="276"/>
+        <w:ind w:right="0" w:left="0" w:firstLine="0"/>
+        <w:jc w:val="left"/>
+        <w:rPr>
+          <w:rFonts w:ascii="Cambria" w:hAnsi="Cambria" w:cs="Cambria" w:eastAsia="Cambria"/>
+          <w:color w:val="auto"/>
+          <w:spacing w:val="0"/>
+          <w:position w:val="0"/>
+          <w:sz w:val="22"/>
+          <w:shd w:fill="auto" w:val="clear"/>
+        </w:rPr>
+      </w:pPr>
+      <w:hyperlink xmlns:r="http://schemas.openxmlformats.org/officeDocument/2006/relationships" r:id="docRId0">
+        <w:r>
+          <w:rPr>
+            <w:rFonts w:ascii="Cambria" w:hAnsi="Cambria" w:cs="Cambria" w:eastAsia="Cambria"/>
+            <w:color w:val="0000FF"/>
+            <w:spacing w:val="0"/>
+            <w:position w:val="0"/>
+            <w:sz w:val="22"/>
+            <w:u w:val="single"/>
+            <w:shd w:fill="auto" w:val="clear"/>
+          </w:rPr>
+          <w:t xml:space="preserve">https://www.themoviedb.org/</w:t>
+        </w:r>
+      </w:hyperlink>
     </w:p>
   </w:body>
 </w:document>

</xml_diff>